<commit_message>
Fix Cloudflare Pages PDF generation fallback
</commit_message>
<xml_diff>
--- a/public/resume.docx
+++ b/public/resume.docx
@@ -32,7 +32,7 @@
         </w:rPr>
         <w:t xml:space="preserve">Melbourne, Australia  |  Australian Citizen  |  +61 0423 830 445  |  </w:t>
       </w:r>
-      <w:hyperlink w:history="1" r:id="rIdhqejmuppz2kujjguj86cf">
+      <w:hyperlink w:history="1" r:id="rIdipvwrhloold0lwtvxwg9i">
         <w:r>
           <w:rPr>
             <w:color w:val="1E3A8A"/>
@@ -51,7 +51,7 @@
         </w:rPr>
         <w:t xml:space="preserve">  |  </w:t>
       </w:r>
-      <w:hyperlink w:history="1" r:id="rIdmsu4fpzdayyok5hkm_g9s">
+      <w:hyperlink w:history="1" r:id="rId2-6kahc0j8dk0n9pils2h">
         <w:r>
           <w:rPr>
             <w:color w:val="1E3A8A"/>

</xml_diff>

<commit_message>
Redesign with 60s/70s funky mustard, espresso, and rounded circular motifs
</commit_message>
<xml_diff>
--- a/public/resume.docx
+++ b/public/resume.docx
@@ -32,7 +32,7 @@
         </w:rPr>
         <w:t xml:space="preserve">Melbourne, Australia  |  Australian Citizen  |  +61 0423 830 445  |  </w:t>
       </w:r>
-      <w:hyperlink w:history="1" r:id="rIdipvwrhloold0lwtvxwg9i">
+      <w:hyperlink w:history="1" r:id="rIdri8xxs4fjpbjhat_qcvwd">
         <w:r>
           <w:rPr>
             <w:color w:val="1E3A8A"/>
@@ -51,7 +51,7 @@
         </w:rPr>
         <w:t xml:space="preserve">  |  </w:t>
       </w:r>
-      <w:hyperlink w:history="1" r:id="rId2-6kahc0j8dk0n9pils2h">
+      <w:hyperlink w:history="1" r:id="rIdmv5ucpqejy6laq07elivp">
         <w:r>
           <w:rPr>
             <w:color w:val="1E3A8A"/>
@@ -66,7 +66,7 @@
     <w:p>
       <w:pPr>
         <w:pBdr>
-          <w:bottom w:val="single" w:color="CCCCCC" w:sz="6" w:space="4"/>
+          <w:bottom w:val="single" w:color="D99B26" w:sz="8" w:space="4"/>
         </w:pBdr>
         <w:spacing w:after="80" w:before="240"/>
       </w:pPr>
@@ -75,7 +75,7 @@
           <w:rFonts w:ascii="Georgia" w:cs="Georgia" w:eastAsia="Georgia" w:hAnsi="Georgia"/>
           <w:b/>
           <w:bCs/>
-          <w:color w:val="111827"/>
+          <w:color w:val="1A110B"/>
           <w:sz w:val="26"/>
           <w:szCs w:val="26"/>
         </w:rPr>
@@ -98,7 +98,7 @@
     <w:p>
       <w:pPr>
         <w:pBdr>
-          <w:bottom w:val="single" w:color="CCCCCC" w:sz="6" w:space="4"/>
+          <w:bottom w:val="single" w:color="D99B26" w:sz="8" w:space="4"/>
         </w:pBdr>
         <w:spacing w:after="80" w:before="240"/>
       </w:pPr>
@@ -107,7 +107,7 @@
           <w:rFonts w:ascii="Georgia" w:cs="Georgia" w:eastAsia="Georgia" w:hAnsi="Georgia"/>
           <w:b/>
           <w:bCs/>
-          <w:color w:val="111827"/>
+          <w:color w:val="1A110B"/>
           <w:sz w:val="26"/>
           <w:szCs w:val="26"/>
         </w:rPr>
@@ -477,7 +477,7 @@
     <w:p>
       <w:pPr>
         <w:pBdr>
-          <w:bottom w:val="single" w:color="CCCCCC" w:sz="6" w:space="4"/>
+          <w:bottom w:val="single" w:color="D99B26" w:sz="8" w:space="4"/>
         </w:pBdr>
         <w:spacing w:after="80" w:before="240"/>
       </w:pPr>
@@ -486,7 +486,7 @@
           <w:rFonts w:ascii="Georgia" w:cs="Georgia" w:eastAsia="Georgia" w:hAnsi="Georgia"/>
           <w:b/>
           <w:bCs/>
-          <w:color w:val="111827"/>
+          <w:color w:val="1A110B"/>
           <w:sz w:val="26"/>
           <w:szCs w:val="26"/>
         </w:rPr>
@@ -608,7 +608,7 @@
     <w:p>
       <w:pPr>
         <w:pBdr>
-          <w:bottom w:val="single" w:color="CCCCCC" w:sz="6" w:space="4"/>
+          <w:bottom w:val="single" w:color="D99B26" w:sz="8" w:space="4"/>
         </w:pBdr>
         <w:spacing w:after="80" w:before="240"/>
       </w:pPr>
@@ -617,7 +617,7 @@
           <w:rFonts w:ascii="Georgia" w:cs="Georgia" w:eastAsia="Georgia" w:hAnsi="Georgia"/>
           <w:b/>
           <w:bCs/>
-          <w:color w:val="111827"/>
+          <w:color w:val="1A110B"/>
           <w:sz w:val="26"/>
           <w:szCs w:val="26"/>
         </w:rPr>

</xml_diff>